<commit_message>
ubah posisi tmbl dark mode kesamping profil
</commit_message>
<xml_diff>
--- a/dokumentasi/Laporan dokumentasi projek kembang kempis tahap 2.docx
+++ b/dokumentasi/Laporan dokumentasi projek kembang kempis tahap 2.docx
@@ -143,17 +143,7 @@
           <w:sz w:val="28"/>
           <w:szCs w:val="28"/>
         </w:rPr>
-        <w:t xml:space="preserve"> </w:t>
-      </w:r>
-      <w:r>
-        <w:rPr>
-          <w:rFonts w:ascii="Times New Roman" w:hAnsi="Times New Roman" w:cs="Times New Roman"/>
-          <w:b/>
-          <w:bCs/>
-          <w:sz w:val="28"/>
-          <w:szCs w:val="28"/>
-        </w:rPr>
-        <w:t>2</w:t>
+        <w:t xml:space="preserve"> 2</w:t>
       </w:r>
     </w:p>
     <w:p>
@@ -246,6 +236,9 @@
         </w:rPr>
       </w:pPr>
       <w:r>
+        <w:rPr>
+          <w:noProof/>
+        </w:rPr>
         <w:drawing>
           <wp:anchor distT="0" distB="0" distL="114300" distR="114300" simplePos="0" relativeHeight="251658240" behindDoc="0" locked="0" layoutInCell="1" allowOverlap="1" wp14:anchorId="63B04E95" wp14:editId="60BC1475">
             <wp:simplePos x="0" y="0"/>
@@ -3358,187 +3351,11 @@
     <w:p>
       <w:pPr>
         <w:pStyle w:val="ListParagraph"/>
-        <w:numPr>
-          <w:ilvl w:val="0"/>
-          <w:numId w:val="4"/>
-        </w:numPr>
         <w:jc w:val="both"/>
         <w:rPr>
           <w:rFonts w:ascii="Times New Roman" w:hAnsi="Times New Roman" w:cs="Times New Roman"/>
-          <w:sz w:val="24"/>
-          <w:szCs w:val="24"/>
-        </w:rPr>
-      </w:pPr>
-      <w:r>
-        <w:rPr>
-          <w:rFonts w:ascii="Times New Roman" w:hAnsi="Times New Roman" w:cs="Times New Roman"/>
-          <w:sz w:val="24"/>
-          <w:szCs w:val="24"/>
-        </w:rPr>
-        <w:t xml:space="preserve">react-native-chart-kit: </w:t>
-      </w:r>
-    </w:p>
-    <w:p>
-      <w:pPr>
-        <w:pStyle w:val="ListParagraph"/>
-        <w:jc w:val="both"/>
-        <w:rPr>
-          <w:rFonts w:ascii="Times New Roman" w:hAnsi="Times New Roman" w:cs="Times New Roman"/>
-          <w:sz w:val="24"/>
-          <w:szCs w:val="24"/>
-        </w:rPr>
-      </w:pPr>
-      <w:proofErr w:type="spellStart"/>
-      <w:r>
-        <w:rPr>
-          <w:rFonts w:ascii="Times New Roman" w:hAnsi="Times New Roman" w:cs="Times New Roman"/>
-          <w:sz w:val="24"/>
-          <w:szCs w:val="24"/>
-        </w:rPr>
-        <w:t>Tetap</w:t>
-      </w:r>
-      <w:proofErr w:type="spellEnd"/>
-      <w:r>
-        <w:rPr>
-          <w:rFonts w:ascii="Times New Roman" w:hAnsi="Times New Roman" w:cs="Times New Roman"/>
-          <w:sz w:val="24"/>
-          <w:szCs w:val="24"/>
-        </w:rPr>
-        <w:t xml:space="preserve"> </w:t>
-      </w:r>
-      <w:proofErr w:type="spellStart"/>
-      <w:r>
-        <w:rPr>
-          <w:rFonts w:ascii="Times New Roman" w:hAnsi="Times New Roman" w:cs="Times New Roman"/>
-          <w:sz w:val="24"/>
-          <w:szCs w:val="24"/>
-        </w:rPr>
-        <w:t>menjadi</w:t>
-      </w:r>
-      <w:proofErr w:type="spellEnd"/>
-      <w:r>
-        <w:rPr>
-          <w:rFonts w:ascii="Times New Roman" w:hAnsi="Times New Roman" w:cs="Times New Roman"/>
-          <w:sz w:val="24"/>
-          <w:szCs w:val="24"/>
-        </w:rPr>
-        <w:t xml:space="preserve"> library </w:t>
-      </w:r>
-      <w:proofErr w:type="spellStart"/>
-      <w:r>
-        <w:rPr>
-          <w:rFonts w:ascii="Times New Roman" w:hAnsi="Times New Roman" w:cs="Times New Roman"/>
-          <w:sz w:val="24"/>
-          <w:szCs w:val="24"/>
-        </w:rPr>
-        <w:t>utama</w:t>
-      </w:r>
-      <w:proofErr w:type="spellEnd"/>
-      <w:r>
-        <w:rPr>
-          <w:rFonts w:ascii="Times New Roman" w:hAnsi="Times New Roman" w:cs="Times New Roman"/>
-          <w:sz w:val="24"/>
-          <w:szCs w:val="24"/>
-        </w:rPr>
-        <w:t xml:space="preserve"> </w:t>
-      </w:r>
-      <w:proofErr w:type="spellStart"/>
-      <w:r>
-        <w:rPr>
-          <w:rFonts w:ascii="Times New Roman" w:hAnsi="Times New Roman" w:cs="Times New Roman"/>
-          <w:sz w:val="24"/>
-          <w:szCs w:val="24"/>
-        </w:rPr>
-        <w:t>untuk</w:t>
-      </w:r>
-      <w:proofErr w:type="spellEnd"/>
-      <w:r>
-        <w:rPr>
-          <w:rFonts w:ascii="Times New Roman" w:hAnsi="Times New Roman" w:cs="Times New Roman"/>
-          <w:sz w:val="24"/>
-          <w:szCs w:val="24"/>
-        </w:rPr>
-        <w:t xml:space="preserve"> </w:t>
-      </w:r>
-      <w:proofErr w:type="spellStart"/>
-      <w:r>
-        <w:rPr>
-          <w:rFonts w:ascii="Times New Roman" w:hAnsi="Times New Roman" w:cs="Times New Roman"/>
-          <w:sz w:val="24"/>
-          <w:szCs w:val="24"/>
-        </w:rPr>
-        <w:t>merender</w:t>
-      </w:r>
-      <w:proofErr w:type="spellEnd"/>
-      <w:r>
-        <w:rPr>
-          <w:rFonts w:ascii="Times New Roman" w:hAnsi="Times New Roman" w:cs="Times New Roman"/>
-          <w:sz w:val="24"/>
-          <w:szCs w:val="24"/>
-        </w:rPr>
-        <w:t xml:space="preserve"> </w:t>
-      </w:r>
-      <w:proofErr w:type="spellStart"/>
-      <w:r>
-        <w:rPr>
-          <w:rFonts w:ascii="Times New Roman" w:hAnsi="Times New Roman" w:cs="Times New Roman"/>
-          <w:sz w:val="24"/>
-          <w:szCs w:val="24"/>
-        </w:rPr>
-        <w:t>BarChart</w:t>
-      </w:r>
-      <w:proofErr w:type="spellEnd"/>
-      <w:r>
-        <w:rPr>
-          <w:rFonts w:ascii="Times New Roman" w:hAnsi="Times New Roman" w:cs="Times New Roman"/>
-          <w:sz w:val="24"/>
-          <w:szCs w:val="24"/>
-        </w:rPr>
-        <w:t xml:space="preserve">, </w:t>
-      </w:r>
-      <w:proofErr w:type="spellStart"/>
-      <w:r>
-        <w:rPr>
-          <w:rFonts w:ascii="Times New Roman" w:hAnsi="Times New Roman" w:cs="Times New Roman"/>
-          <w:sz w:val="24"/>
-          <w:szCs w:val="24"/>
-        </w:rPr>
-        <w:t>LineChart</w:t>
-      </w:r>
-      <w:proofErr w:type="spellEnd"/>
-      <w:r>
-        <w:rPr>
-          <w:rFonts w:ascii="Times New Roman" w:hAnsi="Times New Roman" w:cs="Times New Roman"/>
-          <w:sz w:val="24"/>
-          <w:szCs w:val="24"/>
-        </w:rPr>
-        <w:t xml:space="preserve">, dan </w:t>
-      </w:r>
-      <w:proofErr w:type="spellStart"/>
-      <w:r>
-        <w:rPr>
-          <w:rFonts w:ascii="Times New Roman" w:hAnsi="Times New Roman" w:cs="Times New Roman"/>
-          <w:sz w:val="24"/>
-          <w:szCs w:val="24"/>
-        </w:rPr>
-        <w:t>PieChart</w:t>
-      </w:r>
-      <w:proofErr w:type="spellEnd"/>
-      <w:r>
-        <w:rPr>
-          <w:rFonts w:ascii="Times New Roman" w:hAnsi="Times New Roman" w:cs="Times New Roman"/>
-          <w:sz w:val="24"/>
-          <w:szCs w:val="24"/>
-        </w:rPr>
-        <w:t>.</w:t>
-      </w:r>
-    </w:p>
-    <w:p>
-      <w:pPr>
-        <w:pStyle w:val="ListParagraph"/>
-        <w:jc w:val="both"/>
-        <w:rPr>
-          <w:rFonts w:ascii="Times New Roman" w:hAnsi="Times New Roman" w:cs="Times New Roman"/>
+          <w:b/>
+          <w:bCs/>
           <w:sz w:val="24"/>
           <w:szCs w:val="24"/>
         </w:rPr>
@@ -3558,41 +3375,13 @@
           <w:szCs w:val="24"/>
         </w:rPr>
       </w:pPr>
-      <w:proofErr w:type="spellStart"/>
-      <w:r>
-        <w:rPr>
-          <w:rFonts w:ascii="Times New Roman" w:hAnsi="Times New Roman" w:cs="Times New Roman"/>
-          <w:sz w:val="24"/>
-          <w:szCs w:val="24"/>
-        </w:rPr>
-        <w:t>useTheme</w:t>
-      </w:r>
-      <w:proofErr w:type="spellEnd"/>
-      <w:r>
-        <w:rPr>
-          <w:rFonts w:ascii="Times New Roman" w:hAnsi="Times New Roman" w:cs="Times New Roman"/>
-          <w:sz w:val="24"/>
-          <w:szCs w:val="24"/>
-        </w:rPr>
-        <w:t xml:space="preserve"> (</w:t>
-      </w:r>
-      <w:proofErr w:type="spellStart"/>
-      <w:r>
-        <w:rPr>
-          <w:rFonts w:ascii="Times New Roman" w:hAnsi="Times New Roman" w:cs="Times New Roman"/>
-          <w:sz w:val="24"/>
-          <w:szCs w:val="24"/>
-        </w:rPr>
-        <w:t>ThemeContext</w:t>
-      </w:r>
-      <w:proofErr w:type="spellEnd"/>
-      <w:r>
-        <w:rPr>
-          <w:rFonts w:ascii="Times New Roman" w:hAnsi="Times New Roman" w:cs="Times New Roman"/>
-          <w:sz w:val="24"/>
-          <w:szCs w:val="24"/>
-        </w:rPr>
-        <w:t xml:space="preserve">): </w:t>
+      <w:r>
+        <w:rPr>
+          <w:rFonts w:ascii="Times New Roman" w:hAnsi="Times New Roman" w:cs="Times New Roman"/>
+          <w:sz w:val="24"/>
+          <w:szCs w:val="24"/>
+        </w:rPr>
+        <w:t xml:space="preserve">react-native-chart-kit: </w:t>
       </w:r>
     </w:p>
     <w:p>
@@ -3612,241 +3401,133 @@
           <w:sz w:val="24"/>
           <w:szCs w:val="24"/>
         </w:rPr>
-        <w:t>Penambahan</w:t>
-      </w:r>
-      <w:proofErr w:type="spellEnd"/>
-      <w:r>
-        <w:rPr>
-          <w:rFonts w:ascii="Times New Roman" w:hAnsi="Times New Roman" w:cs="Times New Roman"/>
-          <w:sz w:val="24"/>
-          <w:szCs w:val="24"/>
-        </w:rPr>
-        <w:t xml:space="preserve"> </w:t>
-      </w:r>
-      <w:proofErr w:type="spellStart"/>
-      <w:r>
-        <w:rPr>
-          <w:rFonts w:ascii="Times New Roman" w:hAnsi="Times New Roman" w:cs="Times New Roman"/>
-          <w:sz w:val="24"/>
-          <w:szCs w:val="24"/>
-        </w:rPr>
-        <w:t>dukungan</w:t>
-      </w:r>
-      <w:proofErr w:type="spellEnd"/>
-      <w:r>
-        <w:rPr>
-          <w:rFonts w:ascii="Times New Roman" w:hAnsi="Times New Roman" w:cs="Times New Roman"/>
-          <w:sz w:val="24"/>
-          <w:szCs w:val="24"/>
-        </w:rPr>
-        <w:t xml:space="preserve"> mode </w:t>
-      </w:r>
-      <w:proofErr w:type="spellStart"/>
-      <w:r>
-        <w:rPr>
-          <w:rFonts w:ascii="Times New Roman" w:hAnsi="Times New Roman" w:cs="Times New Roman"/>
-          <w:sz w:val="24"/>
-          <w:szCs w:val="24"/>
-        </w:rPr>
-        <w:t>gelap</w:t>
-      </w:r>
-      <w:proofErr w:type="spellEnd"/>
-      <w:r>
-        <w:rPr>
-          <w:rFonts w:ascii="Times New Roman" w:hAnsi="Times New Roman" w:cs="Times New Roman"/>
-          <w:sz w:val="24"/>
-          <w:szCs w:val="24"/>
-        </w:rPr>
-        <w:t xml:space="preserve"> (</w:t>
-      </w:r>
-      <w:r>
-        <w:rPr>
-          <w:rFonts w:ascii="Times New Roman" w:hAnsi="Times New Roman" w:cs="Times New Roman"/>
-          <w:i/>
-          <w:iCs/>
-          <w:sz w:val="24"/>
-          <w:szCs w:val="24"/>
-        </w:rPr>
-        <w:t>Dark Mode</w:t>
-      </w:r>
-      <w:r>
-        <w:rPr>
-          <w:rFonts w:ascii="Times New Roman" w:hAnsi="Times New Roman" w:cs="Times New Roman"/>
-          <w:sz w:val="24"/>
-          <w:szCs w:val="24"/>
-        </w:rPr>
-        <w:t xml:space="preserve">) yang </w:t>
-      </w:r>
-      <w:proofErr w:type="spellStart"/>
-      <w:r>
-        <w:rPr>
-          <w:rFonts w:ascii="Times New Roman" w:hAnsi="Times New Roman" w:cs="Times New Roman"/>
-          <w:sz w:val="24"/>
-          <w:szCs w:val="24"/>
-        </w:rPr>
-        <w:t>mengatur</w:t>
-      </w:r>
-      <w:proofErr w:type="spellEnd"/>
-      <w:r>
-        <w:rPr>
-          <w:rFonts w:ascii="Times New Roman" w:hAnsi="Times New Roman" w:cs="Times New Roman"/>
-          <w:sz w:val="24"/>
-          <w:szCs w:val="24"/>
-        </w:rPr>
-        <w:t xml:space="preserve"> </w:t>
-      </w:r>
-      <w:proofErr w:type="spellStart"/>
-      <w:r>
-        <w:rPr>
-          <w:rFonts w:ascii="Times New Roman" w:hAnsi="Times New Roman" w:cs="Times New Roman"/>
-          <w:sz w:val="24"/>
-          <w:szCs w:val="24"/>
-        </w:rPr>
-        <w:t>warna</w:t>
-      </w:r>
-      <w:proofErr w:type="spellEnd"/>
-      <w:r>
-        <w:rPr>
-          <w:rFonts w:ascii="Times New Roman" w:hAnsi="Times New Roman" w:cs="Times New Roman"/>
-          <w:sz w:val="24"/>
-          <w:szCs w:val="24"/>
-        </w:rPr>
-        <w:t xml:space="preserve"> </w:t>
-      </w:r>
-      <w:proofErr w:type="spellStart"/>
-      <w:r>
-        <w:rPr>
-          <w:rFonts w:ascii="Times New Roman" w:hAnsi="Times New Roman" w:cs="Times New Roman"/>
-          <w:sz w:val="24"/>
-          <w:szCs w:val="24"/>
-        </w:rPr>
-        <w:t>latar</w:t>
-      </w:r>
-      <w:proofErr w:type="spellEnd"/>
-      <w:r>
-        <w:rPr>
-          <w:rFonts w:ascii="Times New Roman" w:hAnsi="Times New Roman" w:cs="Times New Roman"/>
-          <w:sz w:val="24"/>
-          <w:szCs w:val="24"/>
-        </w:rPr>
-        <w:t xml:space="preserve"> </w:t>
-      </w:r>
-      <w:proofErr w:type="spellStart"/>
-      <w:r>
-        <w:rPr>
-          <w:rFonts w:ascii="Times New Roman" w:hAnsi="Times New Roman" w:cs="Times New Roman"/>
-          <w:sz w:val="24"/>
-          <w:szCs w:val="24"/>
-        </w:rPr>
-        <w:t>belakang</w:t>
-      </w:r>
-      <w:proofErr w:type="spellEnd"/>
-      <w:r>
-        <w:rPr>
-          <w:rFonts w:ascii="Times New Roman" w:hAnsi="Times New Roman" w:cs="Times New Roman"/>
-          <w:sz w:val="24"/>
-          <w:szCs w:val="24"/>
-        </w:rPr>
-        <w:t xml:space="preserve"> dan </w:t>
-      </w:r>
-      <w:proofErr w:type="spellStart"/>
-      <w:r>
-        <w:rPr>
-          <w:rFonts w:ascii="Times New Roman" w:hAnsi="Times New Roman" w:cs="Times New Roman"/>
-          <w:sz w:val="24"/>
-          <w:szCs w:val="24"/>
-        </w:rPr>
-        <w:t>teks</w:t>
-      </w:r>
-      <w:proofErr w:type="spellEnd"/>
-      <w:r>
-        <w:rPr>
-          <w:rFonts w:ascii="Times New Roman" w:hAnsi="Times New Roman" w:cs="Times New Roman"/>
-          <w:sz w:val="24"/>
-          <w:szCs w:val="24"/>
-        </w:rPr>
-        <w:t xml:space="preserve"> </w:t>
-      </w:r>
-      <w:proofErr w:type="spellStart"/>
-      <w:r>
-        <w:rPr>
-          <w:rFonts w:ascii="Times New Roman" w:hAnsi="Times New Roman" w:cs="Times New Roman"/>
-          <w:sz w:val="24"/>
-          <w:szCs w:val="24"/>
-        </w:rPr>
-        <w:t>secara</w:t>
-      </w:r>
-      <w:proofErr w:type="spellEnd"/>
-      <w:r>
-        <w:rPr>
-          <w:rFonts w:ascii="Times New Roman" w:hAnsi="Times New Roman" w:cs="Times New Roman"/>
-          <w:sz w:val="24"/>
-          <w:szCs w:val="24"/>
-        </w:rPr>
-        <w:t xml:space="preserve"> </w:t>
-      </w:r>
-      <w:proofErr w:type="spellStart"/>
-      <w:r>
-        <w:rPr>
-          <w:rFonts w:ascii="Times New Roman" w:hAnsi="Times New Roman" w:cs="Times New Roman"/>
-          <w:sz w:val="24"/>
-          <w:szCs w:val="24"/>
-        </w:rPr>
-        <w:t>dinamis</w:t>
-      </w:r>
-      <w:proofErr w:type="spellEnd"/>
-      <w:r>
-        <w:rPr>
-          <w:rFonts w:ascii="Times New Roman" w:hAnsi="Times New Roman" w:cs="Times New Roman"/>
-          <w:sz w:val="24"/>
-          <w:szCs w:val="24"/>
-        </w:rPr>
-        <w:t xml:space="preserve"> </w:t>
-      </w:r>
-      <w:proofErr w:type="spellStart"/>
-      <w:r>
-        <w:rPr>
-          <w:rFonts w:ascii="Times New Roman" w:hAnsi="Times New Roman" w:cs="Times New Roman"/>
-          <w:sz w:val="24"/>
-          <w:szCs w:val="24"/>
-        </w:rPr>
-        <w:t>berdasarkan</w:t>
-      </w:r>
-      <w:proofErr w:type="spellEnd"/>
-      <w:r>
-        <w:rPr>
-          <w:rFonts w:ascii="Times New Roman" w:hAnsi="Times New Roman" w:cs="Times New Roman"/>
-          <w:sz w:val="24"/>
-          <w:szCs w:val="24"/>
-        </w:rPr>
-        <w:t xml:space="preserve"> </w:t>
-      </w:r>
-      <w:proofErr w:type="spellStart"/>
-      <w:r>
-        <w:rPr>
-          <w:rFonts w:ascii="Times New Roman" w:hAnsi="Times New Roman" w:cs="Times New Roman"/>
-          <w:sz w:val="24"/>
-          <w:szCs w:val="24"/>
-        </w:rPr>
-        <w:t>tema</w:t>
-      </w:r>
-      <w:proofErr w:type="spellEnd"/>
-      <w:r>
-        <w:rPr>
-          <w:rFonts w:ascii="Times New Roman" w:hAnsi="Times New Roman" w:cs="Times New Roman"/>
-          <w:sz w:val="24"/>
-          <w:szCs w:val="24"/>
-        </w:rPr>
-        <w:t xml:space="preserve"> yang </w:t>
-      </w:r>
-      <w:proofErr w:type="spellStart"/>
-      <w:r>
-        <w:rPr>
-          <w:rFonts w:ascii="Times New Roman" w:hAnsi="Times New Roman" w:cs="Times New Roman"/>
-          <w:sz w:val="24"/>
-          <w:szCs w:val="24"/>
-        </w:rPr>
-        <w:t>dipilih</w:t>
+        <w:t>Tetap</w:t>
+      </w:r>
+      <w:proofErr w:type="spellEnd"/>
+      <w:r>
+        <w:rPr>
+          <w:rFonts w:ascii="Times New Roman" w:hAnsi="Times New Roman" w:cs="Times New Roman"/>
+          <w:sz w:val="24"/>
+          <w:szCs w:val="24"/>
+        </w:rPr>
+        <w:t xml:space="preserve"> </w:t>
+      </w:r>
+      <w:proofErr w:type="spellStart"/>
+      <w:r>
+        <w:rPr>
+          <w:rFonts w:ascii="Times New Roman" w:hAnsi="Times New Roman" w:cs="Times New Roman"/>
+          <w:sz w:val="24"/>
+          <w:szCs w:val="24"/>
+        </w:rPr>
+        <w:t>menjadi</w:t>
+      </w:r>
+      <w:proofErr w:type="spellEnd"/>
+      <w:r>
+        <w:rPr>
+          <w:rFonts w:ascii="Times New Roman" w:hAnsi="Times New Roman" w:cs="Times New Roman"/>
+          <w:sz w:val="24"/>
+          <w:szCs w:val="24"/>
+        </w:rPr>
+        <w:t xml:space="preserve"> library </w:t>
+      </w:r>
+      <w:proofErr w:type="spellStart"/>
+      <w:r>
+        <w:rPr>
+          <w:rFonts w:ascii="Times New Roman" w:hAnsi="Times New Roman" w:cs="Times New Roman"/>
+          <w:sz w:val="24"/>
+          <w:szCs w:val="24"/>
+        </w:rPr>
+        <w:t>utama</w:t>
+      </w:r>
+      <w:proofErr w:type="spellEnd"/>
+      <w:r>
+        <w:rPr>
+          <w:rFonts w:ascii="Times New Roman" w:hAnsi="Times New Roman" w:cs="Times New Roman"/>
+          <w:sz w:val="24"/>
+          <w:szCs w:val="24"/>
+        </w:rPr>
+        <w:t xml:space="preserve"> </w:t>
+      </w:r>
+      <w:proofErr w:type="spellStart"/>
+      <w:r>
+        <w:rPr>
+          <w:rFonts w:ascii="Times New Roman" w:hAnsi="Times New Roman" w:cs="Times New Roman"/>
+          <w:sz w:val="24"/>
+          <w:szCs w:val="24"/>
+        </w:rPr>
+        <w:t>untuk</w:t>
+      </w:r>
+      <w:proofErr w:type="spellEnd"/>
+      <w:r>
+        <w:rPr>
+          <w:rFonts w:ascii="Times New Roman" w:hAnsi="Times New Roman" w:cs="Times New Roman"/>
+          <w:sz w:val="24"/>
+          <w:szCs w:val="24"/>
+        </w:rPr>
+        <w:t xml:space="preserve"> </w:t>
+      </w:r>
+      <w:proofErr w:type="spellStart"/>
+      <w:r>
+        <w:rPr>
+          <w:rFonts w:ascii="Times New Roman" w:hAnsi="Times New Roman" w:cs="Times New Roman"/>
+          <w:sz w:val="24"/>
+          <w:szCs w:val="24"/>
+        </w:rPr>
+        <w:t>merender</w:t>
+      </w:r>
+      <w:proofErr w:type="spellEnd"/>
+      <w:r>
+        <w:rPr>
+          <w:rFonts w:ascii="Times New Roman" w:hAnsi="Times New Roman" w:cs="Times New Roman"/>
+          <w:sz w:val="24"/>
+          <w:szCs w:val="24"/>
+        </w:rPr>
+        <w:t xml:space="preserve"> </w:t>
+      </w:r>
+      <w:proofErr w:type="spellStart"/>
+      <w:r>
+        <w:rPr>
+          <w:rFonts w:ascii="Times New Roman" w:hAnsi="Times New Roman" w:cs="Times New Roman"/>
+          <w:sz w:val="24"/>
+          <w:szCs w:val="24"/>
+        </w:rPr>
+        <w:t>BarChart</w:t>
+      </w:r>
+      <w:proofErr w:type="spellEnd"/>
+      <w:r>
+        <w:rPr>
+          <w:rFonts w:ascii="Times New Roman" w:hAnsi="Times New Roman" w:cs="Times New Roman"/>
+          <w:sz w:val="24"/>
+          <w:szCs w:val="24"/>
+        </w:rPr>
+        <w:t xml:space="preserve">, </w:t>
+      </w:r>
+      <w:proofErr w:type="spellStart"/>
+      <w:r>
+        <w:rPr>
+          <w:rFonts w:ascii="Times New Roman" w:hAnsi="Times New Roman" w:cs="Times New Roman"/>
+          <w:sz w:val="24"/>
+          <w:szCs w:val="24"/>
+        </w:rPr>
+        <w:t>LineChart</w:t>
+      </w:r>
+      <w:proofErr w:type="spellEnd"/>
+      <w:r>
+        <w:rPr>
+          <w:rFonts w:ascii="Times New Roman" w:hAnsi="Times New Roman" w:cs="Times New Roman"/>
+          <w:sz w:val="24"/>
+          <w:szCs w:val="24"/>
+        </w:rPr>
+        <w:t xml:space="preserve">, dan </w:t>
+      </w:r>
+      <w:proofErr w:type="spellStart"/>
+      <w:r>
+        <w:rPr>
+          <w:rFonts w:ascii="Times New Roman" w:hAnsi="Times New Roman" w:cs="Times New Roman"/>
+          <w:sz w:val="24"/>
+          <w:szCs w:val="24"/>
+        </w:rPr>
+        <w:t>PieChart</w:t>
       </w:r>
       <w:proofErr w:type="spellEnd"/>
       <w:r>
@@ -3883,13 +3564,41 @@
           <w:szCs w:val="24"/>
         </w:rPr>
       </w:pPr>
-      <w:r>
-        <w:rPr>
-          <w:rFonts w:ascii="Times New Roman" w:hAnsi="Times New Roman" w:cs="Times New Roman"/>
-          <w:sz w:val="24"/>
-          <w:szCs w:val="24"/>
-        </w:rPr>
-        <w:t xml:space="preserve">API_URL &amp; fetch: </w:t>
+      <w:proofErr w:type="spellStart"/>
+      <w:r>
+        <w:rPr>
+          <w:rFonts w:ascii="Times New Roman" w:hAnsi="Times New Roman" w:cs="Times New Roman"/>
+          <w:sz w:val="24"/>
+          <w:szCs w:val="24"/>
+        </w:rPr>
+        <w:t>useTheme</w:t>
+      </w:r>
+      <w:proofErr w:type="spellEnd"/>
+      <w:r>
+        <w:rPr>
+          <w:rFonts w:ascii="Times New Roman" w:hAnsi="Times New Roman" w:cs="Times New Roman"/>
+          <w:sz w:val="24"/>
+          <w:szCs w:val="24"/>
+        </w:rPr>
+        <w:t xml:space="preserve"> (</w:t>
+      </w:r>
+      <w:proofErr w:type="spellStart"/>
+      <w:r>
+        <w:rPr>
+          <w:rFonts w:ascii="Times New Roman" w:hAnsi="Times New Roman" w:cs="Times New Roman"/>
+          <w:sz w:val="24"/>
+          <w:szCs w:val="24"/>
+        </w:rPr>
+        <w:t>ThemeContext</w:t>
+      </w:r>
+      <w:proofErr w:type="spellEnd"/>
+      <w:r>
+        <w:rPr>
+          <w:rFonts w:ascii="Times New Roman" w:hAnsi="Times New Roman" w:cs="Times New Roman"/>
+          <w:sz w:val="24"/>
+          <w:szCs w:val="24"/>
+        </w:rPr>
+        <w:t xml:space="preserve">): </w:t>
       </w:r>
     </w:p>
     <w:p>
@@ -3909,88 +3618,52 @@
           <w:sz w:val="24"/>
           <w:szCs w:val="24"/>
         </w:rPr>
-        <w:t>Digunakan</w:t>
-      </w:r>
-      <w:proofErr w:type="spellEnd"/>
-      <w:r>
-        <w:rPr>
-          <w:rFonts w:ascii="Times New Roman" w:hAnsi="Times New Roman" w:cs="Times New Roman"/>
-          <w:sz w:val="24"/>
-          <w:szCs w:val="24"/>
-        </w:rPr>
-        <w:t xml:space="preserve"> </w:t>
-      </w:r>
-      <w:proofErr w:type="spellStart"/>
-      <w:r>
-        <w:rPr>
-          <w:rFonts w:ascii="Times New Roman" w:hAnsi="Times New Roman" w:cs="Times New Roman"/>
-          <w:sz w:val="24"/>
-          <w:szCs w:val="24"/>
-        </w:rPr>
-        <w:t>untuk</w:t>
-      </w:r>
-      <w:proofErr w:type="spellEnd"/>
-      <w:r>
-        <w:rPr>
-          <w:rFonts w:ascii="Times New Roman" w:hAnsi="Times New Roman" w:cs="Times New Roman"/>
-          <w:sz w:val="24"/>
-          <w:szCs w:val="24"/>
-        </w:rPr>
-        <w:t xml:space="preserve"> </w:t>
-      </w:r>
-      <w:proofErr w:type="spellStart"/>
-      <w:r>
-        <w:rPr>
-          <w:rFonts w:ascii="Times New Roman" w:hAnsi="Times New Roman" w:cs="Times New Roman"/>
-          <w:sz w:val="24"/>
-          <w:szCs w:val="24"/>
-        </w:rPr>
-        <w:t>mengambil</w:t>
-      </w:r>
-      <w:proofErr w:type="spellEnd"/>
-      <w:r>
-        <w:rPr>
-          <w:rFonts w:ascii="Times New Roman" w:hAnsi="Times New Roman" w:cs="Times New Roman"/>
-          <w:sz w:val="24"/>
-          <w:szCs w:val="24"/>
-        </w:rPr>
-        <w:t xml:space="preserve"> data </w:t>
-      </w:r>
-      <w:proofErr w:type="spellStart"/>
-      <w:r>
-        <w:rPr>
-          <w:rFonts w:ascii="Times New Roman" w:hAnsi="Times New Roman" w:cs="Times New Roman"/>
-          <w:sz w:val="24"/>
-          <w:szCs w:val="24"/>
-        </w:rPr>
-        <w:t>laporan</w:t>
-      </w:r>
-      <w:proofErr w:type="spellEnd"/>
-      <w:r>
-        <w:rPr>
-          <w:rFonts w:ascii="Times New Roman" w:hAnsi="Times New Roman" w:cs="Times New Roman"/>
-          <w:sz w:val="24"/>
-          <w:szCs w:val="24"/>
-        </w:rPr>
-        <w:t xml:space="preserve"> </w:t>
-      </w:r>
-      <w:proofErr w:type="spellStart"/>
-      <w:r>
-        <w:rPr>
-          <w:rFonts w:ascii="Times New Roman" w:hAnsi="Times New Roman" w:cs="Times New Roman"/>
-          <w:sz w:val="24"/>
-          <w:szCs w:val="24"/>
-        </w:rPr>
-        <w:t>secara</w:t>
-      </w:r>
-      <w:proofErr w:type="spellEnd"/>
-      <w:r>
-        <w:rPr>
-          <w:rFonts w:ascii="Times New Roman" w:hAnsi="Times New Roman" w:cs="Times New Roman"/>
-          <w:sz w:val="24"/>
-          <w:szCs w:val="24"/>
-        </w:rPr>
-        <w:t xml:space="preserve"> </w:t>
+        <w:t>Penambahan</w:t>
+      </w:r>
+      <w:proofErr w:type="spellEnd"/>
+      <w:r>
+        <w:rPr>
+          <w:rFonts w:ascii="Times New Roman" w:hAnsi="Times New Roman" w:cs="Times New Roman"/>
+          <w:sz w:val="24"/>
+          <w:szCs w:val="24"/>
+        </w:rPr>
+        <w:t xml:space="preserve"> </w:t>
+      </w:r>
+      <w:proofErr w:type="spellStart"/>
+      <w:r>
+        <w:rPr>
+          <w:rFonts w:ascii="Times New Roman" w:hAnsi="Times New Roman" w:cs="Times New Roman"/>
+          <w:sz w:val="24"/>
+          <w:szCs w:val="24"/>
+        </w:rPr>
+        <w:t>dukungan</w:t>
+      </w:r>
+      <w:proofErr w:type="spellEnd"/>
+      <w:r>
+        <w:rPr>
+          <w:rFonts w:ascii="Times New Roman" w:hAnsi="Times New Roman" w:cs="Times New Roman"/>
+          <w:sz w:val="24"/>
+          <w:szCs w:val="24"/>
+        </w:rPr>
+        <w:t xml:space="preserve"> mode </w:t>
+      </w:r>
+      <w:proofErr w:type="spellStart"/>
+      <w:r>
+        <w:rPr>
+          <w:rFonts w:ascii="Times New Roman" w:hAnsi="Times New Roman" w:cs="Times New Roman"/>
+          <w:sz w:val="24"/>
+          <w:szCs w:val="24"/>
+        </w:rPr>
+        <w:t>gelap</w:t>
+      </w:r>
+      <w:proofErr w:type="spellEnd"/>
+      <w:r>
+        <w:rPr>
+          <w:rFonts w:ascii="Times New Roman" w:hAnsi="Times New Roman" w:cs="Times New Roman"/>
+          <w:sz w:val="24"/>
+          <w:szCs w:val="24"/>
+        </w:rPr>
+        <w:t xml:space="preserve"> (</w:t>
       </w:r>
       <w:r>
         <w:rPr>
@@ -4000,60 +3673,186 @@
           <w:sz w:val="24"/>
           <w:szCs w:val="24"/>
         </w:rPr>
-        <w:t>real-time</w:t>
-      </w:r>
-      <w:r>
-        <w:rPr>
-          <w:rFonts w:ascii="Times New Roman" w:hAnsi="Times New Roman" w:cs="Times New Roman"/>
-          <w:sz w:val="24"/>
-          <w:szCs w:val="24"/>
-        </w:rPr>
-        <w:t xml:space="preserve"> </w:t>
-      </w:r>
-      <w:proofErr w:type="spellStart"/>
-      <w:r>
-        <w:rPr>
-          <w:rFonts w:ascii="Times New Roman" w:hAnsi="Times New Roman" w:cs="Times New Roman"/>
-          <w:sz w:val="24"/>
-          <w:szCs w:val="24"/>
-        </w:rPr>
-        <w:t>dari</w:t>
-      </w:r>
-      <w:proofErr w:type="spellEnd"/>
-      <w:r>
-        <w:rPr>
-          <w:rFonts w:ascii="Times New Roman" w:hAnsi="Times New Roman" w:cs="Times New Roman"/>
-          <w:sz w:val="24"/>
-          <w:szCs w:val="24"/>
-        </w:rPr>
-        <w:t xml:space="preserve"> </w:t>
-      </w:r>
-      <w:proofErr w:type="spellStart"/>
-      <w:r>
-        <w:rPr>
-          <w:rFonts w:ascii="Times New Roman" w:hAnsi="Times New Roman" w:cs="Times New Roman"/>
-          <w:sz w:val="24"/>
-          <w:szCs w:val="24"/>
-        </w:rPr>
-        <w:t>alamat</w:t>
-      </w:r>
-      <w:proofErr w:type="spellEnd"/>
-      <w:r>
-        <w:rPr>
-          <w:rFonts w:ascii="Times New Roman" w:hAnsi="Times New Roman" w:cs="Times New Roman"/>
-          <w:sz w:val="24"/>
-          <w:szCs w:val="24"/>
-        </w:rPr>
-        <w:t xml:space="preserve"> backend yang </w:t>
-      </w:r>
-      <w:proofErr w:type="spellStart"/>
-      <w:r>
-        <w:rPr>
-          <w:rFonts w:ascii="Times New Roman" w:hAnsi="Times New Roman" w:cs="Times New Roman"/>
-          <w:sz w:val="24"/>
-          <w:szCs w:val="24"/>
-        </w:rPr>
-        <w:t>terkonfigurasi</w:t>
+        <w:t>Dark Mode</w:t>
+      </w:r>
+      <w:r>
+        <w:rPr>
+          <w:rFonts w:ascii="Times New Roman" w:hAnsi="Times New Roman" w:cs="Times New Roman"/>
+          <w:sz w:val="24"/>
+          <w:szCs w:val="24"/>
+        </w:rPr>
+        <w:t xml:space="preserve">) yang </w:t>
+      </w:r>
+      <w:proofErr w:type="spellStart"/>
+      <w:r>
+        <w:rPr>
+          <w:rFonts w:ascii="Times New Roman" w:hAnsi="Times New Roman" w:cs="Times New Roman"/>
+          <w:sz w:val="24"/>
+          <w:szCs w:val="24"/>
+        </w:rPr>
+        <w:t>mengatur</w:t>
+      </w:r>
+      <w:proofErr w:type="spellEnd"/>
+      <w:r>
+        <w:rPr>
+          <w:rFonts w:ascii="Times New Roman" w:hAnsi="Times New Roman" w:cs="Times New Roman"/>
+          <w:sz w:val="24"/>
+          <w:szCs w:val="24"/>
+        </w:rPr>
+        <w:t xml:space="preserve"> </w:t>
+      </w:r>
+      <w:proofErr w:type="spellStart"/>
+      <w:r>
+        <w:rPr>
+          <w:rFonts w:ascii="Times New Roman" w:hAnsi="Times New Roman" w:cs="Times New Roman"/>
+          <w:sz w:val="24"/>
+          <w:szCs w:val="24"/>
+        </w:rPr>
+        <w:t>warna</w:t>
+      </w:r>
+      <w:proofErr w:type="spellEnd"/>
+      <w:r>
+        <w:rPr>
+          <w:rFonts w:ascii="Times New Roman" w:hAnsi="Times New Roman" w:cs="Times New Roman"/>
+          <w:sz w:val="24"/>
+          <w:szCs w:val="24"/>
+        </w:rPr>
+        <w:t xml:space="preserve"> </w:t>
+      </w:r>
+      <w:proofErr w:type="spellStart"/>
+      <w:r>
+        <w:rPr>
+          <w:rFonts w:ascii="Times New Roman" w:hAnsi="Times New Roman" w:cs="Times New Roman"/>
+          <w:sz w:val="24"/>
+          <w:szCs w:val="24"/>
+        </w:rPr>
+        <w:t>latar</w:t>
+      </w:r>
+      <w:proofErr w:type="spellEnd"/>
+      <w:r>
+        <w:rPr>
+          <w:rFonts w:ascii="Times New Roman" w:hAnsi="Times New Roman" w:cs="Times New Roman"/>
+          <w:sz w:val="24"/>
+          <w:szCs w:val="24"/>
+        </w:rPr>
+        <w:t xml:space="preserve"> </w:t>
+      </w:r>
+      <w:proofErr w:type="spellStart"/>
+      <w:r>
+        <w:rPr>
+          <w:rFonts w:ascii="Times New Roman" w:hAnsi="Times New Roman" w:cs="Times New Roman"/>
+          <w:sz w:val="24"/>
+          <w:szCs w:val="24"/>
+        </w:rPr>
+        <w:t>belakang</w:t>
+      </w:r>
+      <w:proofErr w:type="spellEnd"/>
+      <w:r>
+        <w:rPr>
+          <w:rFonts w:ascii="Times New Roman" w:hAnsi="Times New Roman" w:cs="Times New Roman"/>
+          <w:sz w:val="24"/>
+          <w:szCs w:val="24"/>
+        </w:rPr>
+        <w:t xml:space="preserve"> dan </w:t>
+      </w:r>
+      <w:proofErr w:type="spellStart"/>
+      <w:r>
+        <w:rPr>
+          <w:rFonts w:ascii="Times New Roman" w:hAnsi="Times New Roman" w:cs="Times New Roman"/>
+          <w:sz w:val="24"/>
+          <w:szCs w:val="24"/>
+        </w:rPr>
+        <w:t>teks</w:t>
+      </w:r>
+      <w:proofErr w:type="spellEnd"/>
+      <w:r>
+        <w:rPr>
+          <w:rFonts w:ascii="Times New Roman" w:hAnsi="Times New Roman" w:cs="Times New Roman"/>
+          <w:sz w:val="24"/>
+          <w:szCs w:val="24"/>
+        </w:rPr>
+        <w:t xml:space="preserve"> </w:t>
+      </w:r>
+      <w:proofErr w:type="spellStart"/>
+      <w:r>
+        <w:rPr>
+          <w:rFonts w:ascii="Times New Roman" w:hAnsi="Times New Roman" w:cs="Times New Roman"/>
+          <w:sz w:val="24"/>
+          <w:szCs w:val="24"/>
+        </w:rPr>
+        <w:t>secara</w:t>
+      </w:r>
+      <w:proofErr w:type="spellEnd"/>
+      <w:r>
+        <w:rPr>
+          <w:rFonts w:ascii="Times New Roman" w:hAnsi="Times New Roman" w:cs="Times New Roman"/>
+          <w:sz w:val="24"/>
+          <w:szCs w:val="24"/>
+        </w:rPr>
+        <w:t xml:space="preserve"> </w:t>
+      </w:r>
+      <w:proofErr w:type="spellStart"/>
+      <w:r>
+        <w:rPr>
+          <w:rFonts w:ascii="Times New Roman" w:hAnsi="Times New Roman" w:cs="Times New Roman"/>
+          <w:sz w:val="24"/>
+          <w:szCs w:val="24"/>
+        </w:rPr>
+        <w:t>dinamis</w:t>
+      </w:r>
+      <w:proofErr w:type="spellEnd"/>
+      <w:r>
+        <w:rPr>
+          <w:rFonts w:ascii="Times New Roman" w:hAnsi="Times New Roman" w:cs="Times New Roman"/>
+          <w:sz w:val="24"/>
+          <w:szCs w:val="24"/>
+        </w:rPr>
+        <w:t xml:space="preserve"> </w:t>
+      </w:r>
+      <w:proofErr w:type="spellStart"/>
+      <w:r>
+        <w:rPr>
+          <w:rFonts w:ascii="Times New Roman" w:hAnsi="Times New Roman" w:cs="Times New Roman"/>
+          <w:sz w:val="24"/>
+          <w:szCs w:val="24"/>
+        </w:rPr>
+        <w:t>berdasarkan</w:t>
+      </w:r>
+      <w:proofErr w:type="spellEnd"/>
+      <w:r>
+        <w:rPr>
+          <w:rFonts w:ascii="Times New Roman" w:hAnsi="Times New Roman" w:cs="Times New Roman"/>
+          <w:sz w:val="24"/>
+          <w:szCs w:val="24"/>
+        </w:rPr>
+        <w:t xml:space="preserve"> </w:t>
+      </w:r>
+      <w:proofErr w:type="spellStart"/>
+      <w:r>
+        <w:rPr>
+          <w:rFonts w:ascii="Times New Roman" w:hAnsi="Times New Roman" w:cs="Times New Roman"/>
+          <w:sz w:val="24"/>
+          <w:szCs w:val="24"/>
+        </w:rPr>
+        <w:t>tema</w:t>
+      </w:r>
+      <w:proofErr w:type="spellEnd"/>
+      <w:r>
+        <w:rPr>
+          <w:rFonts w:ascii="Times New Roman" w:hAnsi="Times New Roman" w:cs="Times New Roman"/>
+          <w:sz w:val="24"/>
+          <w:szCs w:val="24"/>
+        </w:rPr>
+        <w:t xml:space="preserve"> yang </w:t>
+      </w:r>
+      <w:proofErr w:type="spellStart"/>
+      <w:r>
+        <w:rPr>
+          <w:rFonts w:ascii="Times New Roman" w:hAnsi="Times New Roman" w:cs="Times New Roman"/>
+          <w:sz w:val="24"/>
+          <w:szCs w:val="24"/>
+        </w:rPr>
+        <w:t>dipilih</w:t>
       </w:r>
       <w:proofErr w:type="spellEnd"/>
       <w:r>
@@ -4090,6 +3889,213 @@
           <w:szCs w:val="24"/>
         </w:rPr>
       </w:pPr>
+      <w:r>
+        <w:rPr>
+          <w:rFonts w:ascii="Times New Roman" w:hAnsi="Times New Roman" w:cs="Times New Roman"/>
+          <w:sz w:val="24"/>
+          <w:szCs w:val="24"/>
+        </w:rPr>
+        <w:t xml:space="preserve">API_URL &amp; fetch: </w:t>
+      </w:r>
+    </w:p>
+    <w:p>
+      <w:pPr>
+        <w:pStyle w:val="ListParagraph"/>
+        <w:jc w:val="both"/>
+        <w:rPr>
+          <w:rFonts w:ascii="Times New Roman" w:hAnsi="Times New Roman" w:cs="Times New Roman"/>
+          <w:sz w:val="24"/>
+          <w:szCs w:val="24"/>
+        </w:rPr>
+      </w:pPr>
+      <w:proofErr w:type="spellStart"/>
+      <w:r>
+        <w:rPr>
+          <w:rFonts w:ascii="Times New Roman" w:hAnsi="Times New Roman" w:cs="Times New Roman"/>
+          <w:sz w:val="24"/>
+          <w:szCs w:val="24"/>
+        </w:rPr>
+        <w:t>Digunakan</w:t>
+      </w:r>
+      <w:proofErr w:type="spellEnd"/>
+      <w:r>
+        <w:rPr>
+          <w:rFonts w:ascii="Times New Roman" w:hAnsi="Times New Roman" w:cs="Times New Roman"/>
+          <w:sz w:val="24"/>
+          <w:szCs w:val="24"/>
+        </w:rPr>
+        <w:t xml:space="preserve"> </w:t>
+      </w:r>
+      <w:proofErr w:type="spellStart"/>
+      <w:r>
+        <w:rPr>
+          <w:rFonts w:ascii="Times New Roman" w:hAnsi="Times New Roman" w:cs="Times New Roman"/>
+          <w:sz w:val="24"/>
+          <w:szCs w:val="24"/>
+        </w:rPr>
+        <w:t>untuk</w:t>
+      </w:r>
+      <w:proofErr w:type="spellEnd"/>
+      <w:r>
+        <w:rPr>
+          <w:rFonts w:ascii="Times New Roman" w:hAnsi="Times New Roman" w:cs="Times New Roman"/>
+          <w:sz w:val="24"/>
+          <w:szCs w:val="24"/>
+        </w:rPr>
+        <w:t xml:space="preserve"> </w:t>
+      </w:r>
+      <w:proofErr w:type="spellStart"/>
+      <w:r>
+        <w:rPr>
+          <w:rFonts w:ascii="Times New Roman" w:hAnsi="Times New Roman" w:cs="Times New Roman"/>
+          <w:sz w:val="24"/>
+          <w:szCs w:val="24"/>
+        </w:rPr>
+        <w:t>mengambil</w:t>
+      </w:r>
+      <w:proofErr w:type="spellEnd"/>
+      <w:r>
+        <w:rPr>
+          <w:rFonts w:ascii="Times New Roman" w:hAnsi="Times New Roman" w:cs="Times New Roman"/>
+          <w:sz w:val="24"/>
+          <w:szCs w:val="24"/>
+        </w:rPr>
+        <w:t xml:space="preserve"> data </w:t>
+      </w:r>
+      <w:proofErr w:type="spellStart"/>
+      <w:r>
+        <w:rPr>
+          <w:rFonts w:ascii="Times New Roman" w:hAnsi="Times New Roman" w:cs="Times New Roman"/>
+          <w:sz w:val="24"/>
+          <w:szCs w:val="24"/>
+        </w:rPr>
+        <w:t>laporan</w:t>
+      </w:r>
+      <w:proofErr w:type="spellEnd"/>
+      <w:r>
+        <w:rPr>
+          <w:rFonts w:ascii="Times New Roman" w:hAnsi="Times New Roman" w:cs="Times New Roman"/>
+          <w:sz w:val="24"/>
+          <w:szCs w:val="24"/>
+        </w:rPr>
+        <w:t xml:space="preserve"> </w:t>
+      </w:r>
+      <w:proofErr w:type="spellStart"/>
+      <w:r>
+        <w:rPr>
+          <w:rFonts w:ascii="Times New Roman" w:hAnsi="Times New Roman" w:cs="Times New Roman"/>
+          <w:sz w:val="24"/>
+          <w:szCs w:val="24"/>
+        </w:rPr>
+        <w:t>secara</w:t>
+      </w:r>
+      <w:proofErr w:type="spellEnd"/>
+      <w:r>
+        <w:rPr>
+          <w:rFonts w:ascii="Times New Roman" w:hAnsi="Times New Roman" w:cs="Times New Roman"/>
+          <w:sz w:val="24"/>
+          <w:szCs w:val="24"/>
+        </w:rPr>
+        <w:t xml:space="preserve"> </w:t>
+      </w:r>
+      <w:r>
+        <w:rPr>
+          <w:rFonts w:ascii="Times New Roman" w:hAnsi="Times New Roman" w:cs="Times New Roman"/>
+          <w:i/>
+          <w:iCs/>
+          <w:sz w:val="24"/>
+          <w:szCs w:val="24"/>
+        </w:rPr>
+        <w:t>real-time</w:t>
+      </w:r>
+      <w:r>
+        <w:rPr>
+          <w:rFonts w:ascii="Times New Roman" w:hAnsi="Times New Roman" w:cs="Times New Roman"/>
+          <w:sz w:val="24"/>
+          <w:szCs w:val="24"/>
+        </w:rPr>
+        <w:t xml:space="preserve"> </w:t>
+      </w:r>
+      <w:proofErr w:type="spellStart"/>
+      <w:r>
+        <w:rPr>
+          <w:rFonts w:ascii="Times New Roman" w:hAnsi="Times New Roman" w:cs="Times New Roman"/>
+          <w:sz w:val="24"/>
+          <w:szCs w:val="24"/>
+        </w:rPr>
+        <w:t>dari</w:t>
+      </w:r>
+      <w:proofErr w:type="spellEnd"/>
+      <w:r>
+        <w:rPr>
+          <w:rFonts w:ascii="Times New Roman" w:hAnsi="Times New Roman" w:cs="Times New Roman"/>
+          <w:sz w:val="24"/>
+          <w:szCs w:val="24"/>
+        </w:rPr>
+        <w:t xml:space="preserve"> </w:t>
+      </w:r>
+      <w:proofErr w:type="spellStart"/>
+      <w:r>
+        <w:rPr>
+          <w:rFonts w:ascii="Times New Roman" w:hAnsi="Times New Roman" w:cs="Times New Roman"/>
+          <w:sz w:val="24"/>
+          <w:szCs w:val="24"/>
+        </w:rPr>
+        <w:t>alamat</w:t>
+      </w:r>
+      <w:proofErr w:type="spellEnd"/>
+      <w:r>
+        <w:rPr>
+          <w:rFonts w:ascii="Times New Roman" w:hAnsi="Times New Roman" w:cs="Times New Roman"/>
+          <w:sz w:val="24"/>
+          <w:szCs w:val="24"/>
+        </w:rPr>
+        <w:t xml:space="preserve"> backend yang </w:t>
+      </w:r>
+      <w:proofErr w:type="spellStart"/>
+      <w:r>
+        <w:rPr>
+          <w:rFonts w:ascii="Times New Roman" w:hAnsi="Times New Roman" w:cs="Times New Roman"/>
+          <w:sz w:val="24"/>
+          <w:szCs w:val="24"/>
+        </w:rPr>
+        <w:t>terkonfigurasi</w:t>
+      </w:r>
+      <w:proofErr w:type="spellEnd"/>
+      <w:r>
+        <w:rPr>
+          <w:rFonts w:ascii="Times New Roman" w:hAnsi="Times New Roman" w:cs="Times New Roman"/>
+          <w:sz w:val="24"/>
+          <w:szCs w:val="24"/>
+        </w:rPr>
+        <w:t>.</w:t>
+      </w:r>
+    </w:p>
+    <w:p>
+      <w:pPr>
+        <w:pStyle w:val="ListParagraph"/>
+        <w:jc w:val="both"/>
+        <w:rPr>
+          <w:rFonts w:ascii="Times New Roman" w:hAnsi="Times New Roman" w:cs="Times New Roman"/>
+          <w:sz w:val="24"/>
+          <w:szCs w:val="24"/>
+        </w:rPr>
+      </w:pPr>
+    </w:p>
+    <w:p>
+      <w:pPr>
+        <w:pStyle w:val="ListParagraph"/>
+        <w:numPr>
+          <w:ilvl w:val="0"/>
+          <w:numId w:val="4"/>
+        </w:numPr>
+        <w:jc w:val="both"/>
+        <w:rPr>
+          <w:rFonts w:ascii="Times New Roman" w:hAnsi="Times New Roman" w:cs="Times New Roman"/>
+          <w:sz w:val="24"/>
+          <w:szCs w:val="24"/>
+        </w:rPr>
+      </w:pPr>
       <w:proofErr w:type="spellStart"/>
       <w:r>
         <w:rPr>
@@ -4538,6 +4544,7 @@
       <w:r>
         <w:rPr>
           <w:rFonts w:ascii="Times New Roman" w:hAnsi="Times New Roman" w:cs="Times New Roman"/>
+          <w:noProof/>
           <w:sz w:val="24"/>
           <w:szCs w:val="24"/>
         </w:rPr>
@@ -7843,14 +7850,18 @@
         <w:jc w:val="both"/>
         <w:rPr>
           <w:rFonts w:ascii="Times New Roman" w:hAnsi="Times New Roman" w:cs="Times New Roman"/>
-          <w:sz w:val="24"/>
-          <w:szCs w:val="24"/>
-        </w:rPr>
-      </w:pPr>
-      <w:proofErr w:type="spellStart"/>
-      <w:r>
-        <w:rPr>
-          <w:rFonts w:ascii="Times New Roman" w:hAnsi="Times New Roman" w:cs="Times New Roman"/>
+          <w:b/>
+          <w:bCs/>
+          <w:sz w:val="24"/>
+          <w:szCs w:val="24"/>
+        </w:rPr>
+      </w:pPr>
+      <w:proofErr w:type="spellStart"/>
+      <w:r>
+        <w:rPr>
+          <w:rFonts w:ascii="Times New Roman" w:hAnsi="Times New Roman" w:cs="Times New Roman"/>
+          <w:b/>
+          <w:bCs/>
           <w:sz w:val="24"/>
           <w:szCs w:val="24"/>
         </w:rPr>
@@ -7860,6 +7871,8 @@
       <w:r>
         <w:rPr>
           <w:rFonts w:ascii="Times New Roman" w:hAnsi="Times New Roman" w:cs="Times New Roman"/>
+          <w:b/>
+          <w:bCs/>
           <w:sz w:val="24"/>
           <w:szCs w:val="24"/>
         </w:rPr>
@@ -7869,6 +7882,8 @@
       <w:r>
         <w:rPr>
           <w:rFonts w:ascii="Times New Roman" w:hAnsi="Times New Roman" w:cs="Times New Roman"/>
+          <w:b/>
+          <w:bCs/>
           <w:sz w:val="24"/>
           <w:szCs w:val="24"/>
         </w:rPr>
@@ -9205,13 +9220,17 @@
         <w:jc w:val="both"/>
         <w:rPr>
           <w:rFonts w:ascii="Times New Roman" w:hAnsi="Times New Roman" w:cs="Times New Roman"/>
-          <w:sz w:val="24"/>
-          <w:szCs w:val="24"/>
-        </w:rPr>
-      </w:pPr>
-      <w:r>
-        <w:rPr>
-          <w:rFonts w:ascii="Times New Roman" w:hAnsi="Times New Roman" w:cs="Times New Roman"/>
+          <w:b/>
+          <w:bCs/>
+          <w:sz w:val="24"/>
+          <w:szCs w:val="24"/>
+        </w:rPr>
+      </w:pPr>
+      <w:r>
+        <w:rPr>
+          <w:rFonts w:ascii="Times New Roman" w:hAnsi="Times New Roman" w:cs="Times New Roman"/>
+          <w:b/>
+          <w:bCs/>
           <w:sz w:val="24"/>
           <w:szCs w:val="24"/>
         </w:rPr>
@@ -9221,12 +9240,25 @@
       <w:r>
         <w:rPr>
           <w:rFonts w:ascii="Times New Roman" w:hAnsi="Times New Roman" w:cs="Times New Roman"/>
+          <w:b/>
+          <w:bCs/>
           <w:sz w:val="24"/>
           <w:szCs w:val="24"/>
         </w:rPr>
         <w:t>Digunakan</w:t>
       </w:r>
       <w:proofErr w:type="spellEnd"/>
+    </w:p>
+    <w:p>
+      <w:pPr>
+        <w:pStyle w:val="ListParagraph"/>
+        <w:jc w:val="both"/>
+        <w:rPr>
+          <w:rFonts w:ascii="Times New Roman" w:hAnsi="Times New Roman" w:cs="Times New Roman"/>
+          <w:sz w:val="24"/>
+          <w:szCs w:val="24"/>
+        </w:rPr>
+      </w:pPr>
     </w:p>
     <w:p>
       <w:pPr>
@@ -11767,6 +11799,7 @@
   <w:style w:type="character" w:default="1" w:styleId="DefaultParagraphFont">
     <w:name w:val="Default Paragraph Font"/>
     <w:uiPriority w:val="1"/>
+    <w:semiHidden/>
     <w:unhideWhenUsed/>
   </w:style>
   <w:style w:type="table" w:default="1" w:styleId="TableNormal">

</xml_diff>